<commit_message>
Producer's approval of all episodes; Batch 3 corrections; spoken direction cut from Episode 22
Co-Authored-By: Claude Opus 5.5 <noreply@anthropic.com>
</commit_message>
<xml_diff>
--- a/production/thumma_ihtadayt/recovered_scripts/episodes_20_22/HIKAYA_Thumma_Ihtadayt_Episodes_20-22_Recovered.docx
+++ b/production/thumma_ihtadayt/recovered_scripts/episodes_20_22/HIKAYA_Thumma_Ihtadayt_Episodes_20-22_Recovered.docx
@@ -2355,25 +2355,62 @@
           <w:szCs w:val="17"/>
           <w:rtl/>
         </w:rPr>
-        <w:t xml:space="preserve">‏Batch 3.zip/Narrŕatttor.wav · 326.96–364.10 ث</w:t>
-      </w:r>
-    </w:p>
-    <w:p>
-      <w:pPr>
-        <w:bidi/>
-        <w:spacing w:after="140" w:before="0" w:line="360"/>
-      </w:pPr>
-      <w:r>
-        <w:rPr>
-          <w:rFonts w:ascii="Arial" w:cs="Arial" w:hAnsi="Arial"/>
-          <w:b w:val="false"/>
-          <w:i w:val="false"/>
-          <w:color w:val="2E2419"/>
-          <w:sz w:val="26"/>
-          <w:szCs w:val="26"/>
-          <w:rtl/>
-        </w:rPr>
-        <w:t xml:space="preserve">‏وكان عليه أن يتذكر الدرس الذي بدأ منه كل شيء لقد طلب يوما أن لا يحكم الناس عليه قبل أن يسمعوه وعليه الآن أن يمنح الآخرين الحق نفسه في الاختلاف والسؤال بتصاعد عاطفي هادئ في المكتبة التي بدأت برزم من الكتب القادمة من العراق جلس محمد يتذكر أول لقاء مع منعم تذكر البحر وتذكر بغداد وتذكر طرقات النجف ومجالس العلم وتذكر ليالي الحيرة التي لم يعرف فيها إلى أين يقوده البحث</w:t>
+        <w:t xml:space="preserve">‏Batch 3.zip/Narrŕatttor.wav · 326.96–340.88 ث</w:t>
+      </w:r>
+    </w:p>
+    <w:p>
+      <w:pPr>
+        <w:bidi/>
+        <w:spacing w:after="140" w:before="0" w:line="360"/>
+      </w:pPr>
+      <w:r>
+        <w:rPr>
+          <w:rFonts w:ascii="Arial" w:cs="Arial" w:hAnsi="Arial"/>
+          <w:b w:val="false"/>
+          <w:i w:val="false"/>
+          <w:color w:val="2E2419"/>
+          <w:sz w:val="26"/>
+          <w:szCs w:val="26"/>
+          <w:rtl/>
+        </w:rPr>
+        <w:t xml:space="preserve">‏وكان عليه أن يتذكر الدرس الذي بدأ منه كل شيء لقد طلب يوما أن لا يحكم الناس عليه قبل أن يسمعوه وعليه الآن أن يمنح الآخرين الحق نفسه في الاختلاف والسؤال</w:t>
+      </w:r>
+    </w:p>
+    <w:p>
+      <w:pPr>
+        <w:keepNext/>
+        <w:bidi/>
+        <w:spacing w:after="20" w:before="0" w:line="300"/>
+      </w:pPr>
+      <w:r>
+        <w:rPr>
+          <w:rFonts w:ascii="Arial" w:cs="Arial" w:hAnsi="Arial"/>
+          <w:b w:val="false"/>
+          <w:i w:val="false"/>
+          <w:color w:val="7A6A55"/>
+          <w:sz w:val="17"/>
+          <w:szCs w:val="17"/>
+          <w:rtl/>
+        </w:rPr>
+        <w:t xml:space="preserve">‏Batch 3.zip/Narrŕatttor.wav · 343.30–364.10 ث</w:t>
+      </w:r>
+    </w:p>
+    <w:p>
+      <w:pPr>
+        <w:bidi/>
+        <w:spacing w:after="140" w:before="0" w:line="360"/>
+      </w:pPr>
+      <w:r>
+        <w:rPr>
+          <w:rFonts w:ascii="Arial" w:cs="Arial" w:hAnsi="Arial"/>
+          <w:b w:val="false"/>
+          <w:i w:val="false"/>
+          <w:color w:val="2E2419"/>
+          <w:sz w:val="26"/>
+          <w:szCs w:val="26"/>
+          <w:rtl/>
+        </w:rPr>
+        <w:t xml:space="preserve">‏في المكتبة التي بدأت برزم من الكتب القادمة من العراق جلس محمد يتذكر أول لقاء مع منعم تذكر البحر وتذكر بغداد وتذكر طرقات النجف ومجالس العلم وتذكر ليالي الحيرة التي لم يعرف فيها إلى أين يقوده البحث</w:t>
       </w:r>
     </w:p>
     <w:p>
@@ -2633,6 +2670,25 @@
           <w:szCs w:val="17"/>
           <w:rtl/>
         </w:rPr>
+        <w:t xml:space="preserve">‏تصحيح من المنتج: «أساء الظن» ← «أساؤوا الظن»</w:t>
+      </w:r>
+    </w:p>
+    <w:p>
+      <w:pPr>
+        <w:keepNext/>
+        <w:bidi/>
+        <w:spacing w:after="20" w:before="0" w:line="300"/>
+      </w:pPr>
+      <w:r>
+        <w:rPr>
+          <w:rFonts w:ascii="Arial" w:cs="Arial" w:hAnsi="Arial"/>
+          <w:b w:val="false"/>
+          <w:i w:val="false"/>
+          <w:color w:val="7A6A55"/>
+          <w:sz w:val="17"/>
+          <w:szCs w:val="17"/>
+          <w:rtl/>
+        </w:rPr>
         <w:t xml:space="preserve">‏Batch 3.zip/Tiììjani.wav · 204.64–222.42 ث</w:t>
       </w:r>
     </w:p>
@@ -2799,7 +2855,7 @@
           <w:szCs w:val="26"/>
           <w:rtl/>
         </w:rPr>
-        <w:t xml:space="preserve">‏كم من أناس أساء الظن بمن لم يعرفوهم وكم كنت أنا واحدا منهم</w:t>
+        <w:t xml:space="preserve">‏كم من أناس أساؤوا الظن بمن لم يعرفوهم وكم كنت أنا واحدا منهم</w:t>
       </w:r>
     </w:p>
     <w:p>

</xml_diff>